<commit_message>
📄 DOCX firmado: TEST001 - 14/1/2026, 1:23:46 a.m.
</commit_message>
<xml_diff>
--- a/data/declaraciones/signed/TEST001.docx
+++ b/data/declaraciones/signed/TEST001.docx
@@ -200,23 +200,23 @@
         <w:rPr>
           <w:lang w:val="es-MX"/>
         </w:rPr>
-        <w:t xml:space="preserve">Nombre del Proveedor o Razón Social: Pruebas</w:t>
-      </w:r>
-    </w:p>
-    <w:p>
-      <w:pPr>
-        <w:spacing w:before="309"/>
-        <w:ind w:right="4"/>
-        <w:jc w:val="both"/>
-        <w:rPr>
-          <w:lang w:val="es-MX"/>
-        </w:rPr>
-      </w:pPr>
-      <w:r>
-        <w:rPr>
-          <w:lang w:val="es-MX"/>
-        </w:rPr>
-        <w:t xml:space="preserve">Nombre del Representante Legal: Pruebas</w:t>
+        <w:t xml:space="preserve">Nombre del Proveedor o Razón Social: sc</w:t>
+      </w:r>
+    </w:p>
+    <w:p>
+      <w:pPr>
+        <w:spacing w:before="309"/>
+        <w:ind w:right="4"/>
+        <w:jc w:val="both"/>
+        <w:rPr>
+          <w:lang w:val="es-MX"/>
+        </w:rPr>
+      </w:pPr>
+      <w:r>
+        <w:rPr>
+          <w:lang w:val="es-MX"/>
+        </w:rPr>
+        <w:t xml:space="preserve">Nombre del Representante Legal: dv</w:t>
       </w:r>
     </w:p>
     <w:p>

</xml_diff>

<commit_message>
📄 DOCX firmado: TEST001 - 14/1/2026, 8:06:20 p.m.
</commit_message>
<xml_diff>
--- a/data/declaraciones/signed/TEST001.docx
+++ b/data/declaraciones/signed/TEST001.docx
@@ -216,7 +216,7 @@
         <w:rPr>
           <w:lang w:val="es-MX"/>
         </w:rPr>
-        <w:t xml:space="preserve">Nombre del Representante Legal: dv</w:t>
+        <w:t xml:space="preserve">Nombre del Representante Legal: dsf</w:t>
       </w:r>
     </w:p>
     <w:p>
@@ -311,7 +311,7 @@
         <w:rPr>
           <w:lang w:val="es-MX"/>
         </w:rPr>
-        <w:t xml:space="preserve">Fecha: 13 de enero de 2026</w:t>
+        <w:t xml:space="preserve">Fecha: 14 de enero de 2026</w:t>
       </w:r>
     </w:p>
     <w:p>

</xml_diff>